<commit_message>
new file CT and MIR
</commit_message>
<xml_diff>
--- a/China/CT/MIR 光学透镜设计.docx
+++ b/China/CT/MIR 光学透镜设计.docx
@@ -1,6 +1,6 @@
 
 <file path=word/document.xml><?xml version="1.0" encoding="utf-8"?>
-<w:document xmlns:wpc="http://schemas.microsoft.com/office/word/2010/wordprocessingCanvas" xmlns:cx="http://schemas.microsoft.com/office/drawing/2014/chartex" xmlns:cx1="http://schemas.microsoft.com/office/drawing/2015/9/8/chartex" xmlns:cx2="http://schemas.microsoft.com/office/drawing/2015/10/21/chartex" xmlns:cx3="http://schemas.microsoft.com/office/drawing/2016/5/9/chartex" xmlns:cx4="http://schemas.microsoft.com/office/drawing/2016/5/10/chartex" xmlns:cx5="http://schemas.microsoft.com/office/drawing/2016/5/11/chartex" xmlns:cx6="http://schemas.microsoft.com/office/drawing/2016/5/12/chartex" xmlns:cx7="http://schemas.microsoft.com/office/drawing/2016/5/13/chartex" xmlns:cx8="http://schemas.microsoft.com/office/drawing/2016/5/14/chartex" xmlns:mc="http://schemas.openxmlformats.org/markup-compatibility/2006" xmlns:aink="http://schemas.microsoft.com/office/drawing/2016/ink" xmlns:am3d="http://schemas.microsoft.com/office/drawing/2017/model3d" xmlns:o="urn:schemas-microsoft-com:office:office" xmlns:r="http://schemas.openxmlformats.org/officeDocument/2006/relationships" xmlns:m="http://schemas.openxmlformats.org/officeDocument/2006/math" xmlns:v="urn:schemas-microsoft-com:vml" xmlns:wp14="http://schemas.microsoft.com/office/word/2010/wordprocessingDrawing" xmlns:wp="http://schemas.openxmlformats.org/drawingml/2006/wordprocessingDrawing" xmlns:w10="urn:schemas-microsoft-com:office:word" xmlns:w="http://schemas.openxmlformats.org/wordprocessingml/2006/main" xmlns:w14="http://schemas.microsoft.com/office/word/2010/wordml" xmlns:w15="http://schemas.microsoft.com/office/word/2012/wordml" xmlns:w16cid="http://schemas.microsoft.com/office/word/2016/wordml/cid" xmlns:w16se="http://schemas.microsoft.com/office/word/2015/wordml/symex" xmlns:wpg="http://schemas.microsoft.com/office/word/2010/wordprocessingGroup" xmlns:wpi="http://schemas.microsoft.com/office/word/2010/wordprocessingInk" xmlns:wne="http://schemas.microsoft.com/office/word/2006/wordml" xmlns:wps="http://schemas.microsoft.com/office/word/2010/wordprocessingShape" mc:Ignorable="w14 w15 w16se w16cid wp14">
+<w:document xmlns:wpc="http://schemas.microsoft.com/office/word/2010/wordprocessingCanvas" xmlns:cx="http://schemas.microsoft.com/office/drawing/2014/chartex" xmlns:cx1="http://schemas.microsoft.com/office/drawing/2015/9/8/chartex" xmlns:cx2="http://schemas.microsoft.com/office/drawing/2015/10/21/chartex" xmlns:cx3="http://schemas.microsoft.com/office/drawing/2016/5/9/chartex" xmlns:cx4="http://schemas.microsoft.com/office/drawing/2016/5/10/chartex" xmlns:cx5="http://schemas.microsoft.com/office/drawing/2016/5/11/chartex" xmlns:cx6="http://schemas.microsoft.com/office/drawing/2016/5/12/chartex" xmlns:cx7="http://schemas.microsoft.com/office/drawing/2016/5/13/chartex" xmlns:cx8="http://schemas.microsoft.com/office/drawing/2016/5/14/chartex" xmlns:mc="http://schemas.openxmlformats.org/markup-compatibility/2006" xmlns:aink="http://schemas.microsoft.com/office/drawing/2016/ink" xmlns:am3d="http://schemas.microsoft.com/office/drawing/2017/model3d" xmlns:o="urn:schemas-microsoft-com:office:office" xmlns:oel="http://schemas.microsoft.com/office/2019/extlst" xmlns:r="http://schemas.openxmlformats.org/officeDocument/2006/relationships" xmlns:m="http://schemas.openxmlformats.org/officeDocument/2006/math" xmlns:v="urn:schemas-microsoft-com:vml" xmlns:wp14="http://schemas.microsoft.com/office/word/2010/wordprocessingDrawing" xmlns:wp="http://schemas.openxmlformats.org/drawingml/2006/wordprocessingDrawing" xmlns:w10="urn:schemas-microsoft-com:office:word" xmlns:w="http://schemas.openxmlformats.org/wordprocessingml/2006/main" xmlns:w14="http://schemas.microsoft.com/office/word/2010/wordml" xmlns:w15="http://schemas.microsoft.com/office/word/2012/wordml" xmlns:w16cex="http://schemas.microsoft.com/office/word/2018/wordml/cex" xmlns:w16cid="http://schemas.microsoft.com/office/word/2016/wordml/cid" xmlns:w16="http://schemas.microsoft.com/office/word/2018/wordml" xmlns:w16du="http://schemas.microsoft.com/office/word/2023/wordml/word16du" xmlns:w16sdtdh="http://schemas.microsoft.com/office/word/2020/wordml/sdtdatahash" xmlns:w16sdtfl="http://schemas.microsoft.com/office/word/2024/wordml/sdtformatlock" xmlns:w16se="http://schemas.microsoft.com/office/word/2015/wordml/symex" xmlns:wpg="http://schemas.microsoft.com/office/word/2010/wordprocessingGroup" xmlns:wpi="http://schemas.microsoft.com/office/word/2010/wordprocessingInk" xmlns:wne="http://schemas.microsoft.com/office/word/2006/wordml" xmlns:wps="http://schemas.microsoft.com/office/word/2010/wordprocessingShape" mc:Ignorable="w14 w15 w16se w16cid w16 w16cex w16sdtdh w16sdtfl w16du wp14">
   <w:body>
     <w:p>
       <w:r>
@@ -91,7 +91,13 @@
         <w:rPr>
           <w:rFonts w:hint="eastAsia"/>
         </w:rPr>
-        <w:t>一．计算</w:t>
+        <w:t>I</w:t>
+      </w:r>
+      <w:r>
+        <w:rPr>
+          <w:rFonts w:hint="eastAsia"/>
+        </w:rPr>
+        <w:t>．计算</w:t>
       </w:r>
       <w:r>
         <w:rPr>
@@ -471,27 +477,14 @@
       <w:r>
         <w:t xml:space="preserve">Figure </w:t>
       </w:r>
-      <w:r>
-        <w:fldChar w:fldCharType="begin"/>
-      </w:r>
-      <w:r>
-        <w:instrText xml:space="preserve"> SEQ Figure \* ARABIC </w:instrText>
-      </w:r>
-      <w:r>
-        <w:fldChar w:fldCharType="separate"/>
-      </w:r>
-      <w:r>
-        <w:rPr>
-          <w:noProof/>
-        </w:rPr>
-        <w:t>1</w:t>
-      </w:r>
-      <w:r>
-        <w:rPr>
-          <w:noProof/>
-        </w:rPr>
-        <w:fldChar w:fldCharType="end"/>
-      </w:r>
+      <w:fldSimple w:instr=" SEQ Figure \* ARABIC ">
+        <w:r>
+          <w:rPr>
+            <w:noProof/>
+          </w:rPr>
+          <w:t>1</w:t>
+        </w:r>
+      </w:fldSimple>
       <w:bookmarkEnd w:id="0"/>
       <w:r>
         <w:rPr>
@@ -565,27 +558,14 @@
       <w:r>
         <w:t xml:space="preserve">Figure </w:t>
       </w:r>
-      <w:r>
-        <w:fldChar w:fldCharType="begin"/>
-      </w:r>
-      <w:r>
-        <w:instrText xml:space="preserve"> SEQ Figure \* ARABIC </w:instrText>
-      </w:r>
-      <w:r>
-        <w:fldChar w:fldCharType="separate"/>
-      </w:r>
-      <w:r>
-        <w:rPr>
-          <w:noProof/>
-        </w:rPr>
-        <w:t>2</w:t>
-      </w:r>
-      <w:r>
-        <w:rPr>
-          <w:noProof/>
-        </w:rPr>
-        <w:fldChar w:fldCharType="end"/>
-      </w:r>
+      <w:fldSimple w:instr=" SEQ Figure \* ARABIC ">
+        <w:r>
+          <w:rPr>
+            <w:noProof/>
+          </w:rPr>
+          <w:t>2</w:t>
+        </w:r>
+      </w:fldSimple>
       <w:bookmarkEnd w:id="1"/>
       <w:r>
         <w:t xml:space="preserve">. </w:t>
@@ -693,7 +673,19 @@
         <w:rPr>
           <w:rFonts w:hint="eastAsia"/>
         </w:rPr>
-        <w:t>极像磁面分布</w:t>
+        <w:t>极</w:t>
+      </w:r>
+      <w:r>
+        <w:rPr>
+          <w:rFonts w:hint="eastAsia"/>
+        </w:rPr>
+        <w:t>向</w:t>
+      </w:r>
+      <w:r>
+        <w:rPr>
+          <w:rFonts w:hint="eastAsia"/>
+        </w:rPr>
+        <w:t>磁面分布</w:t>
       </w:r>
     </w:p>
     <w:p/>
@@ -702,8 +694,6 @@
       <w:pPr>
         <w:ind w:firstLine="432"/>
       </w:pPr>
-      <w:bookmarkStart w:id="3" w:name="_GoBack"/>
-      <w:bookmarkEnd w:id="3"/>
       <w:r>
         <w:rPr>
           <w:rFonts w:hint="eastAsia"/>
@@ -794,7 +784,6 @@
       <w:r>
         <w:t xml:space="preserve">~1.78 </w:t>
       </w:r>
-      <w:proofErr w:type="gramStart"/>
       <w:r>
         <w:rPr>
           <w:rFonts w:hint="eastAsia"/>
@@ -804,7 +793,6 @@
       <w:r>
         <w:t>[</w:t>
       </w:r>
-      <w:proofErr w:type="gramEnd"/>
       <w:r>
         <w:t>Recent advance progress of HL-3 experiments</w:t>
       </w:r>
@@ -820,6 +808,31 @@
     </w:p>
     <w:p>
       <w:pPr>
+        <w:rPr>
+          <w:rFonts w:hint="eastAsia"/>
+        </w:rPr>
+      </w:pPr>
+      <w:r>
+        <w:rPr>
+          <w:rFonts w:hint="eastAsia"/>
+        </w:rPr>
+        <w:t>II</w:t>
+      </w:r>
+      <w:r>
+        <w:rPr>
+          <w:rFonts w:hint="eastAsia"/>
+        </w:rPr>
+        <w:t>：</w:t>
+      </w:r>
+      <w:r>
+        <w:rPr>
+          <w:rFonts w:hint="eastAsia"/>
+        </w:rPr>
+        <w:t>截止层形状</w:t>
+      </w:r>
+    </w:p>
+    <w:p>
+      <w:pPr>
         <w:ind w:firstLine="432"/>
       </w:pPr>
       <w:r>
@@ -907,7 +920,19 @@
         <w:rPr>
           <w:rFonts w:hint="eastAsia"/>
         </w:rPr>
-        <w:t>极像磁面分布，通过将一维密度剖面延拓至二维可得</w:t>
+        <w:t>极</w:t>
+      </w:r>
+      <w:r>
+        <w:rPr>
+          <w:rFonts w:hint="eastAsia"/>
+        </w:rPr>
+        <w:t>向</w:t>
+      </w:r>
+      <w:r>
+        <w:rPr>
+          <w:rFonts w:hint="eastAsia"/>
+        </w:rPr>
+        <w:t>磁面分布，通过将一维密度剖面延拓至二维可得</w:t>
       </w:r>
       <w:r>
         <w:fldChar w:fldCharType="begin"/>
@@ -1141,7 +1166,6 @@
         <w:t>对应的右旋截止层形状。</w:t>
       </w:r>
     </w:p>
-    <w:p/>
     <w:p>
       <w:pPr>
         <w:keepNext/>
@@ -1207,200 +1231,206 @@
         <w:pStyle w:val="Caption"/>
         <w:jc w:val="center"/>
       </w:pPr>
-      <w:bookmarkStart w:id="4" w:name="_Ref220589824"/>
+      <w:bookmarkStart w:id="3" w:name="_Ref220589824"/>
       <w:r>
         <w:t xml:space="preserve">Figure </w:t>
       </w:r>
+      <w:fldSimple w:instr=" SEQ Figure \* ARABIC ">
+        <w:r>
+          <w:rPr>
+            <w:noProof/>
+          </w:rPr>
+          <w:t>4</w:t>
+        </w:r>
+      </w:fldSimple>
+      <w:bookmarkEnd w:id="3"/>
+      <w:r>
+        <w:rPr>
+          <w:rFonts w:hint="eastAsia"/>
+        </w:rPr>
+        <w:t>.</w:t>
+      </w:r>
+      <w:r>
+        <w:t xml:space="preserve"> Shot#6606</w:t>
+      </w:r>
+      <w:r>
+        <w:rPr>
+          <w:rFonts w:hint="eastAsia"/>
+        </w:rPr>
+        <w:t>等离子体参数分布</w:t>
+      </w:r>
+      <w:r>
+        <w:rPr>
+          <w:rFonts w:hint="eastAsia"/>
+        </w:rPr>
+        <w:t>:</w:t>
+      </w:r>
+      <w:r>
+        <w:t>(a)</w:t>
+      </w:r>
+      <w:r>
+        <w:rPr>
+          <w:rFonts w:hint="eastAsia"/>
+        </w:rPr>
+        <w:t>磁场分布</w:t>
+      </w:r>
+      <w:r>
+        <w:rPr>
+          <w:rFonts w:hint="eastAsia"/>
+        </w:rPr>
+        <w:t>，</w:t>
+      </w:r>
+      <w:r>
+        <w:t>(b)</w:t>
+      </w:r>
+      <w:r>
+        <w:rPr>
+          <w:rFonts w:hint="eastAsia"/>
+        </w:rPr>
+        <w:t>密度分布</w:t>
+      </w:r>
+      <w:r>
+        <w:rPr>
+          <w:rFonts w:hint="eastAsia"/>
+        </w:rPr>
+        <w:t>，</w:t>
+      </w:r>
+      <w:r>
+        <w:rPr>
+          <w:rFonts w:hint="eastAsia"/>
+        </w:rPr>
+        <w:t>(</w:t>
+      </w:r>
+      <w:r>
+        <w:t>c)</w:t>
+      </w:r>
+      <w:r>
+        <w:rPr>
+          <w:rFonts w:hint="eastAsia"/>
+        </w:rPr>
+        <w:t>右旋截止频率分布，</w:t>
+      </w:r>
+      <w:r>
+        <w:rPr>
+          <w:rFonts w:hint="eastAsia"/>
+        </w:rPr>
+        <w:t>(</w:t>
+      </w:r>
+      <w:r>
+        <w:t xml:space="preserve">d)60GHz </w:t>
+      </w:r>
+      <w:r>
+        <w:rPr>
+          <w:rFonts w:hint="eastAsia"/>
+        </w:rPr>
+        <w:t>与</w:t>
+      </w:r>
+      <w:r>
+        <w:rPr>
+          <w:rFonts w:hint="eastAsia"/>
+        </w:rPr>
+        <w:t>3</w:t>
+      </w:r>
+      <w:r>
+        <w:t>0 GH</w:t>
+      </w:r>
+      <w:r>
+        <w:rPr>
+          <w:rFonts w:hint="eastAsia"/>
+        </w:rPr>
+        <w:t>z</w:t>
+      </w:r>
+      <w:r>
+        <w:rPr>
+          <w:rFonts w:hint="eastAsia"/>
+        </w:rPr>
+        <w:t>频率的右旋截止层。</w:t>
+      </w:r>
+    </w:p>
+    <w:p>
+      <w:pPr>
+        <w:ind w:firstLine="204"/>
+      </w:pPr>
+      <w:r>
+        <w:rPr>
+          <w:rFonts w:hint="eastAsia"/>
+        </w:rPr>
+        <w:t xml:space="preserve"> </w:t>
+      </w:r>
+      <w:r>
+        <w:rPr>
+          <w:rFonts w:hint="eastAsia"/>
+        </w:rPr>
+        <w:t>对</w:t>
+      </w:r>
+      <w:r>
+        <w:rPr>
+          <w:rFonts w:hint="eastAsia"/>
+        </w:rPr>
+        <w:t>z</w:t>
+      </w:r>
+      <w:r>
+        <w:t xml:space="preserve"> = [-0.4m 0.4m] </w:t>
+      </w:r>
+      <w:r>
+        <w:rPr>
+          <w:rFonts w:hint="eastAsia"/>
+        </w:rPr>
+        <w:t>区间截止层曲率拟合，得到截止层曲率沿约化半径的分布，如</w:t>
+      </w:r>
       <w:r>
         <w:fldChar w:fldCharType="begin"/>
       </w:r>
       <w:r>
-        <w:instrText xml:space="preserve"> SEQ Figure \* ARABIC </w:instrText>
+        <w:instrText xml:space="preserve"> </w:instrText>
+      </w:r>
+      <w:r>
+        <w:rPr>
+          <w:rFonts w:hint="eastAsia"/>
+        </w:rPr>
+        <w:instrText>REF _Ref220606795 \h</w:instrText>
+      </w:r>
+      <w:r>
+        <w:instrText xml:space="preserve"> </w:instrText>
       </w:r>
       <w:r>
         <w:fldChar w:fldCharType="separate"/>
       </w:r>
       <w:r>
+        <w:t xml:space="preserve">Figure </w:t>
+      </w:r>
+      <w:r>
         <w:rPr>
           <w:noProof/>
         </w:rPr>
-        <w:t>4</w:t>
-      </w:r>
-      <w:r>
-        <w:rPr>
-          <w:noProof/>
-        </w:rPr>
+        <w:t>5</w:t>
+      </w:r>
+      <w:r>
         <w:fldChar w:fldCharType="end"/>
       </w:r>
-      <w:bookmarkEnd w:id="4"/>
-      <w:r>
-        <w:rPr>
-          <w:rFonts w:hint="eastAsia"/>
-        </w:rPr>
-        <w:t>.</w:t>
-      </w:r>
-      <w:r>
-        <w:t xml:space="preserve"> Shot#6606</w:t>
-      </w:r>
-      <w:r>
-        <w:rPr>
-          <w:rFonts w:hint="eastAsia"/>
-        </w:rPr>
-        <w:t>等离子体参数分布</w:t>
-      </w:r>
-      <w:r>
-        <w:rPr>
-          <w:rFonts w:hint="eastAsia"/>
-        </w:rPr>
-        <w:t>:</w:t>
-      </w:r>
-      <w:r>
-        <w:t>(</w:t>
-      </w:r>
-      <w:proofErr w:type="gramStart"/>
-      <w:r>
-        <w:t>a)</w:t>
-      </w:r>
-      <w:r>
-        <w:rPr>
-          <w:rFonts w:hint="eastAsia"/>
-        </w:rPr>
-        <w:t>磁场分布</w:t>
-      </w:r>
-      <w:proofErr w:type="gramEnd"/>
-      <w:r>
-        <w:rPr>
-          <w:rFonts w:hint="eastAsia"/>
-        </w:rPr>
-        <w:t>，</w:t>
-      </w:r>
-      <w:r>
-        <w:t>(b)</w:t>
-      </w:r>
-      <w:r>
-        <w:rPr>
-          <w:rFonts w:hint="eastAsia"/>
-        </w:rPr>
-        <w:t>密度分布</w:t>
-      </w:r>
-      <w:r>
-        <w:rPr>
-          <w:rFonts w:hint="eastAsia"/>
-        </w:rPr>
-        <w:t>，</w:t>
-      </w:r>
-      <w:r>
-        <w:rPr>
-          <w:rFonts w:hint="eastAsia"/>
-        </w:rPr>
-        <w:t>(</w:t>
-      </w:r>
-      <w:r>
-        <w:t>c)</w:t>
-      </w:r>
-      <w:r>
-        <w:rPr>
-          <w:rFonts w:hint="eastAsia"/>
-        </w:rPr>
-        <w:t>右旋截止频率分布，</w:t>
-      </w:r>
-      <w:r>
-        <w:rPr>
-          <w:rFonts w:hint="eastAsia"/>
-        </w:rPr>
-        <w:t>(</w:t>
-      </w:r>
-      <w:r>
-        <w:t xml:space="preserve">d)60GHz </w:t>
-      </w:r>
-      <w:r>
-        <w:rPr>
-          <w:rFonts w:hint="eastAsia"/>
-        </w:rPr>
-        <w:t>与</w:t>
-      </w:r>
-      <w:r>
-        <w:rPr>
-          <w:rFonts w:hint="eastAsia"/>
-        </w:rPr>
-        <w:t>3</w:t>
-      </w:r>
-      <w:r>
-        <w:t>0 GH</w:t>
-      </w:r>
-      <w:r>
-        <w:rPr>
-          <w:rFonts w:hint="eastAsia"/>
-        </w:rPr>
-        <w:t>z</w:t>
-      </w:r>
-      <w:r>
-        <w:rPr>
-          <w:rFonts w:hint="eastAsia"/>
-        </w:rPr>
-        <w:t>频率的右旋截止层。</w:t>
-      </w:r>
-    </w:p>
-    <w:p>
-      <w:pPr>
-        <w:ind w:firstLine="204"/>
-      </w:pPr>
-      <w:r>
-        <w:rPr>
-          <w:rFonts w:hint="eastAsia"/>
-        </w:rPr>
+      <w:r>
         <w:t xml:space="preserve"> </w:t>
       </w:r>
       <w:r>
         <w:rPr>
           <w:rFonts w:hint="eastAsia"/>
         </w:rPr>
-        <w:t>对</w:t>
-      </w:r>
-      <w:r>
-        <w:rPr>
-          <w:rFonts w:hint="eastAsia"/>
-        </w:rPr>
-        <w:t>z</w:t>
-      </w:r>
-      <w:r>
-        <w:t xml:space="preserve"> = [-0.4m 0.4m] </w:t>
-      </w:r>
-      <w:r>
-        <w:rPr>
-          <w:rFonts w:hint="eastAsia"/>
-        </w:rPr>
-        <w:t>区间截止层曲率拟合，得到截止层曲率沿约化半径的分布，如</w:t>
-      </w:r>
-      <w:r>
-        <w:fldChar w:fldCharType="begin"/>
-      </w:r>
-      <w:r>
-        <w:instrText xml:space="preserve"> </w:instrText>
-      </w:r>
-      <w:r>
-        <w:rPr>
-          <w:rFonts w:hint="eastAsia"/>
-        </w:rPr>
-        <w:instrText>REF _Ref220606795 \h</w:instrText>
-      </w:r>
-      <w:r>
-        <w:instrText xml:space="preserve"> </w:instrText>
-      </w:r>
-      <w:r>
-        <w:fldChar w:fldCharType="separate"/>
-      </w:r>
-      <w:r>
-        <w:t xml:space="preserve">Figure </w:t>
-      </w:r>
-      <w:r>
-        <w:rPr>
-          <w:noProof/>
-        </w:rPr>
-        <w:t>5</w:t>
-      </w:r>
-      <w:r>
-        <w:fldChar w:fldCharType="end"/>
+        <w:t>所示。因此，需要设计透镜，使其光学在边界具备</w:t>
+      </w:r>
+      <w:r>
+        <w:rPr>
+          <w:rFonts w:hint="eastAsia"/>
+        </w:rPr>
+        <w:t>R</w:t>
+      </w:r>
+      <w:r>
+        <w:t xml:space="preserve">=0.55 </w:t>
+      </w:r>
+      <w:r>
+        <w:rPr>
+          <w:rFonts w:hint="eastAsia"/>
+        </w:rPr>
+        <w:t>m</w:t>
       </w:r>
       <w:r>
         <w:t xml:space="preserve"> </w:t>
@@ -1409,32 +1439,16 @@
         <w:rPr>
           <w:rFonts w:hint="eastAsia"/>
         </w:rPr>
-        <w:t>所示。因此，需要设计透镜，使其光学在边界具备</w:t>
-      </w:r>
-      <w:r>
-        <w:rPr>
-          <w:rFonts w:hint="eastAsia"/>
-        </w:rPr>
-        <w:t>R</w:t>
-      </w:r>
-      <w:r>
-        <w:t xml:space="preserve">=0.55 </w:t>
-      </w:r>
-      <w:r>
-        <w:rPr>
-          <w:rFonts w:hint="eastAsia"/>
-        </w:rPr>
-        <w:t>m</w:t>
-      </w:r>
-      <w:r>
-        <w:t xml:space="preserve"> </w:t>
-      </w:r>
-      <w:r>
-        <w:rPr>
-          <w:rFonts w:hint="eastAsia"/>
-        </w:rPr>
         <w:t>的匹配条件。</w:t>
       </w:r>
+    </w:p>
+    <w:p/>
+    <w:p>
+      <w:pPr>
+        <w:rPr>
+          <w:rFonts w:hint="eastAsia"/>
+        </w:rPr>
+      </w:pPr>
     </w:p>
     <w:p>
       <w:pPr>
@@ -1448,9 +1462,9 @@
         </w:rPr>
         <w:lastRenderedPageBreak/>
         <w:drawing>
-          <wp:inline distT="0" distB="0" distL="0" distR="0" wp14:anchorId="61A4AFD3" wp14:editId="221F53D4">
-            <wp:extent cx="4727275" cy="2336870"/>
-            <wp:effectExtent l="0" t="0" r="0" b="6350"/>
+          <wp:inline distT="0" distB="0" distL="0" distR="0" wp14:anchorId="61A4AFD3" wp14:editId="0EB66CBE">
+            <wp:extent cx="4334991" cy="2142950"/>
+            <wp:effectExtent l="0" t="0" r="8890" b="0"/>
             <wp:docPr id="1" name="Picture 6">
               <a:extLst xmlns:a="http://schemas.openxmlformats.org/drawingml/2006/main">
                 <a:ext uri="{FF2B5EF4-FFF2-40B4-BE49-F238E27FC236}">
@@ -1485,7 +1499,7 @@
                   <pic:spPr>
                     <a:xfrm>
                       <a:off x="0" y="0"/>
-                      <a:ext cx="4736596" cy="2341478"/>
+                      <a:ext cx="4344348" cy="2147575"/>
                     </a:xfrm>
                     <a:prstGeom prst="rect">
                       <a:avLst/>
@@ -1503,72 +1517,270 @@
         <w:pStyle w:val="Caption"/>
         <w:jc w:val="center"/>
       </w:pPr>
-      <w:bookmarkStart w:id="5" w:name="_Ref220606795"/>
-      <w:bookmarkStart w:id="6" w:name="_Ref220606770"/>
+      <w:bookmarkStart w:id="4" w:name="_Ref220606795"/>
+      <w:bookmarkStart w:id="5" w:name="_Ref220606770"/>
       <w:r>
         <w:t xml:space="preserve">Figure </w:t>
       </w:r>
-      <w:r>
-        <w:fldChar w:fldCharType="begin"/>
-      </w:r>
-      <w:r>
-        <w:instrText xml:space="preserve"> SEQ Figure \* ARABIC </w:instrText>
-      </w:r>
-      <w:r>
-        <w:fldChar w:fldCharType="separate"/>
-      </w:r>
-      <w:r>
-        <w:rPr>
-          <w:noProof/>
-        </w:rPr>
-        <w:t>5</w:t>
-      </w:r>
-      <w:r>
-        <w:rPr>
-          <w:noProof/>
-        </w:rPr>
-        <w:fldChar w:fldCharType="end"/>
+      <w:fldSimple w:instr=" SEQ Figure \* ARABIC ">
+        <w:r>
+          <w:rPr>
+            <w:noProof/>
+          </w:rPr>
+          <w:t>5</w:t>
+        </w:r>
+      </w:fldSimple>
+      <w:bookmarkEnd w:id="4"/>
+      <w:r>
+        <w:rPr>
+          <w:rFonts w:hint="eastAsia"/>
+        </w:rPr>
+        <w:t>.</w:t>
+      </w:r>
+      <w:r>
+        <w:t xml:space="preserve"> (a)z=[-0.4 0.4]m </w:t>
+      </w:r>
+      <w:r>
+        <w:rPr>
+          <w:rFonts w:hint="eastAsia"/>
+        </w:rPr>
+        <w:t>区间截止层，</w:t>
+      </w:r>
+      <w:r>
+        <w:rPr>
+          <w:rFonts w:hint="eastAsia"/>
+        </w:rPr>
+        <w:t>(</w:t>
+      </w:r>
+      <w:r>
+        <w:t>b)</w:t>
+      </w:r>
+      <w:r>
+        <w:rPr>
+          <w:rFonts w:hint="eastAsia"/>
+        </w:rPr>
+        <w:t>截止曲率沿约化半径分布</w:t>
       </w:r>
       <w:bookmarkEnd w:id="5"/>
-      <w:r>
-        <w:rPr>
-          <w:rFonts w:hint="eastAsia"/>
-        </w:rPr>
-        <w:t>.</w:t>
-      </w:r>
-      <w:r>
-        <w:t xml:space="preserve"> (a)z</w:t>
-      </w:r>
-      <w:proofErr w:type="gramStart"/>
-      <w:r>
-        <w:t>=[</w:t>
-      </w:r>
-      <w:proofErr w:type="gramEnd"/>
-      <w:r>
-        <w:t xml:space="preserve">-0.4 0.4]m </w:t>
-      </w:r>
-      <w:r>
-        <w:rPr>
-          <w:rFonts w:hint="eastAsia"/>
-        </w:rPr>
-        <w:t>区间截止层，</w:t>
-      </w:r>
-      <w:r>
-        <w:rPr>
-          <w:rFonts w:hint="eastAsia"/>
-        </w:rPr>
-        <w:t>(</w:t>
-      </w:r>
-      <w:r>
-        <w:t>b)</w:t>
-      </w:r>
-      <w:r>
-        <w:rPr>
-          <w:rFonts w:hint="eastAsia"/>
-        </w:rPr>
-        <w:t>截止曲率沿约化半径分布</w:t>
-      </w:r>
-      <w:bookmarkEnd w:id="6"/>
+    </w:p>
+    <w:p/>
+    <w:p>
+      <w:r>
+        <w:rPr>
+          <w:rFonts w:hint="eastAsia"/>
+        </w:rPr>
+        <w:t>III</w:t>
+      </w:r>
+      <w:r>
+        <w:rPr>
+          <w:rFonts w:hint="eastAsia"/>
+        </w:rPr>
+        <w:t>．</w:t>
+      </w:r>
+      <w:r>
+        <w:rPr>
+          <w:rFonts w:hint="eastAsia"/>
+        </w:rPr>
+        <w:t xml:space="preserve"> </w:t>
+      </w:r>
+      <w:r>
+        <w:rPr>
+          <w:rFonts w:hint="eastAsia"/>
+        </w:rPr>
+        <w:t>接收透镜设计</w:t>
+      </w:r>
+    </w:p>
+    <w:p>
+      <w:r>
+        <w:rPr>
+          <w:rFonts w:hint="eastAsia"/>
+        </w:rPr>
+        <w:t>天线分布：</w:t>
+      </w:r>
+      <w:r>
+        <w:rPr>
+          <w:rFonts w:hint="eastAsia"/>
+        </w:rPr>
+        <w:t xml:space="preserve"> y =</w:t>
+      </w:r>
+      <w:proofErr w:type="spellStart"/>
+      <w:r>
+        <w:rPr>
+          <w:rFonts w:hint="eastAsia"/>
+        </w:rPr>
+        <w:t>linspace</w:t>
+      </w:r>
+      <w:proofErr w:type="spellEnd"/>
+      <w:r>
+        <w:rPr>
+          <w:rFonts w:hint="eastAsia"/>
+        </w:rPr>
+        <w:t>(-146,146,12) mm</w:t>
+      </w:r>
+    </w:p>
+    <w:p>
+      <w:pPr>
+        <w:rPr>
+          <w:rFonts w:hint="eastAsia"/>
+        </w:rPr>
+      </w:pPr>
+      <w:r>
+        <w:rPr>
+          <w:rFonts w:hint="eastAsia"/>
+        </w:rPr>
+        <w:t>根据光学互易原理，天线接收光路可等效为各天线发射的</w:t>
+      </w:r>
+      <w:r>
+        <w:rPr>
+          <w:rFonts w:hint="eastAsia"/>
+        </w:rPr>
+        <w:t>光经过光学透镜所构成的光路。</w:t>
+      </w:r>
+    </w:p>
+    <w:p>
+      <w:pPr>
+        <w:rPr>
+          <w:rFonts w:hint="eastAsia"/>
+        </w:rPr>
+      </w:pPr>
+      <w:r>
+        <w:rPr>
+          <w:rFonts w:hint="eastAsia"/>
+        </w:rPr>
+        <w:t>各天线接收方向相互平行，可视为无限远处的物</w:t>
+      </w:r>
+      <w:r>
+        <w:rPr>
+          <w:rFonts w:hint="eastAsia"/>
+        </w:rPr>
+        <w:t>面</w:t>
+      </w:r>
+      <w:r>
+        <w:rPr>
+          <w:rFonts w:hint="eastAsia"/>
+        </w:rPr>
+        <w:t>发出的光。该物</w:t>
+      </w:r>
+      <w:r>
+        <w:rPr>
+          <w:rFonts w:hint="eastAsia"/>
+        </w:rPr>
+        <w:t>面</w:t>
+      </w:r>
+      <w:r>
+        <w:rPr>
+          <w:rFonts w:hint="eastAsia"/>
+        </w:rPr>
+        <w:t>经过一组光学透镜后在等离子体中的光学特征</w:t>
+      </w:r>
+      <w:r>
+        <w:rPr>
+          <w:rFonts w:hint="eastAsia"/>
+        </w:rPr>
+        <w:t>可简化为一束平行光照射在凸透镜后所聚焦的光学路径。而光学透镜组所实现的功能可用一个聚焦凸透镜等效。光学入射方向由聚焦位置决定，凸透镜的焦距由透镜组决定。</w:t>
+      </w:r>
+    </w:p>
+    <w:p>
+      <w:pPr>
+        <w:keepNext/>
+      </w:pPr>
+      <w:r>
+        <w:drawing>
+          <wp:inline distT="0" distB="0" distL="0" distR="0" wp14:anchorId="663CC018" wp14:editId="5C401410">
+            <wp:extent cx="5943600" cy="2831465"/>
+            <wp:effectExtent l="0" t="0" r="0" b="6985"/>
+            <wp:docPr id="37" name="Picture 36">
+              <a:extLst xmlns:a="http://schemas.openxmlformats.org/drawingml/2006/main">
+                <a:ext uri="{FF2B5EF4-FFF2-40B4-BE49-F238E27FC236}">
+                  <a16:creationId xmlns:a16="http://schemas.microsoft.com/office/drawing/2014/main" id="{9D5FF109-0F1E-39FF-EF43-20A9872D7CB9}"/>
+                </a:ext>
+              </a:extLst>
+            </wp:docPr>
+            <wp:cNvGraphicFramePr>
+              <a:graphicFrameLocks xmlns:a="http://schemas.openxmlformats.org/drawingml/2006/main" noChangeAspect="1"/>
+            </wp:cNvGraphicFramePr>
+            <a:graphic xmlns:a="http://schemas.openxmlformats.org/drawingml/2006/main">
+              <a:graphicData uri="http://schemas.openxmlformats.org/drawingml/2006/picture">
+                <pic:pic xmlns:pic="http://schemas.openxmlformats.org/drawingml/2006/picture">
+                  <pic:nvPicPr>
+                    <pic:cNvPr id="37" name="Picture 36">
+                      <a:extLst>
+                        <a:ext uri="{FF2B5EF4-FFF2-40B4-BE49-F238E27FC236}">
+                          <a16:creationId xmlns:a16="http://schemas.microsoft.com/office/drawing/2014/main" id="{9D5FF109-0F1E-39FF-EF43-20A9872D7CB9}"/>
+                        </a:ext>
+                      </a:extLst>
+                    </pic:cNvPr>
+                    <pic:cNvPicPr>
+                      <a:picLocks noChangeAspect="1"/>
+                    </pic:cNvPicPr>
+                  </pic:nvPicPr>
+                  <pic:blipFill>
+                    <a:blip r:embed="rId12"/>
+                    <a:stretch>
+                      <a:fillRect/>
+                    </a:stretch>
+                  </pic:blipFill>
+                  <pic:spPr>
+                    <a:xfrm>
+                      <a:off x="0" y="0"/>
+                      <a:ext cx="5943600" cy="2831465"/>
+                    </a:xfrm>
+                    <a:prstGeom prst="rect">
+                      <a:avLst/>
+                    </a:prstGeom>
+                  </pic:spPr>
+                </pic:pic>
+              </a:graphicData>
+            </a:graphic>
+          </wp:inline>
+        </w:drawing>
+      </w:r>
+    </w:p>
+    <w:p>
+      <w:pPr>
+        <w:pStyle w:val="Caption"/>
+        <w:rPr>
+          <w:rFonts w:hint="eastAsia"/>
+        </w:rPr>
+      </w:pPr>
+      <w:r>
+        <w:t xml:space="preserve">Figure </w:t>
+      </w:r>
+      <w:fldSimple w:instr=" SEQ Figure \* ARABIC ">
+        <w:r>
+          <w:rPr>
+            <w:noProof/>
+          </w:rPr>
+          <w:t>6</w:t>
+        </w:r>
+      </w:fldSimple>
+      <w:r>
+        <w:rPr>
+          <w:rFonts w:hint="eastAsia"/>
+        </w:rPr>
+        <w:t xml:space="preserve"> </w:t>
+      </w:r>
+      <w:r>
+        <w:rPr>
+          <w:rFonts w:hint="eastAsia"/>
+        </w:rPr>
+        <w:t>等效透镜图</w:t>
+      </w:r>
+    </w:p>
+    <w:p>
+      <w:pPr>
+        <w:rPr>
+          <w:rFonts w:hint="eastAsia"/>
+        </w:rPr>
+      </w:pPr>
+    </w:p>
+    <w:p/>
+    <w:p>
+      <w:pPr>
+        <w:rPr>
+          <w:rFonts w:hint="eastAsia"/>
+        </w:rPr>
+      </w:pPr>
     </w:p>
     <w:sectPr>
       <w:pgSz w:w="12240" w:h="15840"/>
@@ -1581,7 +1793,7 @@
 </file>
 
 <file path=word/endnotes.xml><?xml version="1.0" encoding="utf-8"?>
-<w:endnotes xmlns:wpc="http://schemas.microsoft.com/office/word/2010/wordprocessingCanvas" xmlns:cx="http://schemas.microsoft.com/office/drawing/2014/chartex" xmlns:cx1="http://schemas.microsoft.com/office/drawing/2015/9/8/chartex" xmlns:cx2="http://schemas.microsoft.com/office/drawing/2015/10/21/chartex" xmlns:cx3="http://schemas.microsoft.com/office/drawing/2016/5/9/chartex" xmlns:cx4="http://schemas.microsoft.com/office/drawing/2016/5/10/chartex" xmlns:cx5="http://schemas.microsoft.com/office/drawing/2016/5/11/chartex" xmlns:cx6="http://schemas.microsoft.com/office/drawing/2016/5/12/chartex" xmlns:cx7="http://schemas.microsoft.com/office/drawing/2016/5/13/chartex" xmlns:cx8="http://schemas.microsoft.com/office/drawing/2016/5/14/chartex" xmlns:mc="http://schemas.openxmlformats.org/markup-compatibility/2006" xmlns:aink="http://schemas.microsoft.com/office/drawing/2016/ink" xmlns:am3d="http://schemas.microsoft.com/office/drawing/2017/model3d" xmlns:o="urn:schemas-microsoft-com:office:office" xmlns:r="http://schemas.openxmlformats.org/officeDocument/2006/relationships" xmlns:m="http://schemas.openxmlformats.org/officeDocument/2006/math" xmlns:v="urn:schemas-microsoft-com:vml" xmlns:wp14="http://schemas.microsoft.com/office/word/2010/wordprocessingDrawing" xmlns:wp="http://schemas.openxmlformats.org/drawingml/2006/wordprocessingDrawing" xmlns:w10="urn:schemas-microsoft-com:office:word" xmlns:w="http://schemas.openxmlformats.org/wordprocessingml/2006/main" xmlns:w14="http://schemas.microsoft.com/office/word/2010/wordml" xmlns:w15="http://schemas.microsoft.com/office/word/2012/wordml" xmlns:w16cid="http://schemas.microsoft.com/office/word/2016/wordml/cid" xmlns:w16se="http://schemas.microsoft.com/office/word/2015/wordml/symex" xmlns:wpg="http://schemas.microsoft.com/office/word/2010/wordprocessingGroup" xmlns:wpi="http://schemas.microsoft.com/office/word/2010/wordprocessingInk" xmlns:wne="http://schemas.microsoft.com/office/word/2006/wordml" xmlns:wps="http://schemas.microsoft.com/office/word/2010/wordprocessingShape" mc:Ignorable="w14 w15 w16se w16cid wp14">
+<w:endnotes xmlns:wpc="http://schemas.microsoft.com/office/word/2010/wordprocessingCanvas" xmlns:cx="http://schemas.microsoft.com/office/drawing/2014/chartex" xmlns:cx1="http://schemas.microsoft.com/office/drawing/2015/9/8/chartex" xmlns:cx2="http://schemas.microsoft.com/office/drawing/2015/10/21/chartex" xmlns:cx3="http://schemas.microsoft.com/office/drawing/2016/5/9/chartex" xmlns:cx4="http://schemas.microsoft.com/office/drawing/2016/5/10/chartex" xmlns:cx5="http://schemas.microsoft.com/office/drawing/2016/5/11/chartex" xmlns:cx6="http://schemas.microsoft.com/office/drawing/2016/5/12/chartex" xmlns:cx7="http://schemas.microsoft.com/office/drawing/2016/5/13/chartex" xmlns:cx8="http://schemas.microsoft.com/office/drawing/2016/5/14/chartex" xmlns:mc="http://schemas.openxmlformats.org/markup-compatibility/2006" xmlns:aink="http://schemas.microsoft.com/office/drawing/2016/ink" xmlns:am3d="http://schemas.microsoft.com/office/drawing/2017/model3d" xmlns:o="urn:schemas-microsoft-com:office:office" xmlns:oel="http://schemas.microsoft.com/office/2019/extlst" xmlns:r="http://schemas.openxmlformats.org/officeDocument/2006/relationships" xmlns:m="http://schemas.openxmlformats.org/officeDocument/2006/math" xmlns:v="urn:schemas-microsoft-com:vml" xmlns:wp14="http://schemas.microsoft.com/office/word/2010/wordprocessingDrawing" xmlns:wp="http://schemas.openxmlformats.org/drawingml/2006/wordprocessingDrawing" xmlns:w10="urn:schemas-microsoft-com:office:word" xmlns:w="http://schemas.openxmlformats.org/wordprocessingml/2006/main" xmlns:w14="http://schemas.microsoft.com/office/word/2010/wordml" xmlns:w15="http://schemas.microsoft.com/office/word/2012/wordml" xmlns:w16cex="http://schemas.microsoft.com/office/word/2018/wordml/cex" xmlns:w16cid="http://schemas.microsoft.com/office/word/2016/wordml/cid" xmlns:w16="http://schemas.microsoft.com/office/word/2018/wordml" xmlns:w16du="http://schemas.microsoft.com/office/word/2023/wordml/word16du" xmlns:w16sdtdh="http://schemas.microsoft.com/office/word/2020/wordml/sdtdatahash" xmlns:w16sdtfl="http://schemas.microsoft.com/office/word/2024/wordml/sdtformatlock" xmlns:w16se="http://schemas.microsoft.com/office/word/2015/wordml/symex" xmlns:wpg="http://schemas.microsoft.com/office/word/2010/wordprocessingGroup" xmlns:wpi="http://schemas.microsoft.com/office/word/2010/wordprocessingInk" xmlns:wne="http://schemas.microsoft.com/office/word/2006/wordml" xmlns:wps="http://schemas.microsoft.com/office/word/2010/wordprocessingShape" mc:Ignorable="w14 w15 w16se w16cid w16 w16cex w16sdtdh w16sdtfl w16du wp14">
   <w:endnote w:type="separator" w:id="-1">
     <w:p>
       <w:pPr>
@@ -1606,7 +1818,7 @@
 </file>
 
 <file path=word/footnotes.xml><?xml version="1.0" encoding="utf-8"?>
-<w:footnotes xmlns:wpc="http://schemas.microsoft.com/office/word/2010/wordprocessingCanvas" xmlns:cx="http://schemas.microsoft.com/office/drawing/2014/chartex" xmlns:cx1="http://schemas.microsoft.com/office/drawing/2015/9/8/chartex" xmlns:cx2="http://schemas.microsoft.com/office/drawing/2015/10/21/chartex" xmlns:cx3="http://schemas.microsoft.com/office/drawing/2016/5/9/chartex" xmlns:cx4="http://schemas.microsoft.com/office/drawing/2016/5/10/chartex" xmlns:cx5="http://schemas.microsoft.com/office/drawing/2016/5/11/chartex" xmlns:cx6="http://schemas.microsoft.com/office/drawing/2016/5/12/chartex" xmlns:cx7="http://schemas.microsoft.com/office/drawing/2016/5/13/chartex" xmlns:cx8="http://schemas.microsoft.com/office/drawing/2016/5/14/chartex" xmlns:mc="http://schemas.openxmlformats.org/markup-compatibility/2006" xmlns:aink="http://schemas.microsoft.com/office/drawing/2016/ink" xmlns:am3d="http://schemas.microsoft.com/office/drawing/2017/model3d" xmlns:o="urn:schemas-microsoft-com:office:office" xmlns:r="http://schemas.openxmlformats.org/officeDocument/2006/relationships" xmlns:m="http://schemas.openxmlformats.org/officeDocument/2006/math" xmlns:v="urn:schemas-microsoft-com:vml" xmlns:wp14="http://schemas.microsoft.com/office/word/2010/wordprocessingDrawing" xmlns:wp="http://schemas.openxmlformats.org/drawingml/2006/wordprocessingDrawing" xmlns:w10="urn:schemas-microsoft-com:office:word" xmlns:w="http://schemas.openxmlformats.org/wordprocessingml/2006/main" xmlns:w14="http://schemas.microsoft.com/office/word/2010/wordml" xmlns:w15="http://schemas.microsoft.com/office/word/2012/wordml" xmlns:w16cid="http://schemas.microsoft.com/office/word/2016/wordml/cid" xmlns:w16se="http://schemas.microsoft.com/office/word/2015/wordml/symex" xmlns:wpg="http://schemas.microsoft.com/office/word/2010/wordprocessingGroup" xmlns:wpi="http://schemas.microsoft.com/office/word/2010/wordprocessingInk" xmlns:wne="http://schemas.microsoft.com/office/word/2006/wordml" xmlns:wps="http://schemas.microsoft.com/office/word/2010/wordprocessingShape" mc:Ignorable="w14 w15 w16se w16cid wp14">
+<w:footnotes xmlns:wpc="http://schemas.microsoft.com/office/word/2010/wordprocessingCanvas" xmlns:cx="http://schemas.microsoft.com/office/drawing/2014/chartex" xmlns:cx1="http://schemas.microsoft.com/office/drawing/2015/9/8/chartex" xmlns:cx2="http://schemas.microsoft.com/office/drawing/2015/10/21/chartex" xmlns:cx3="http://schemas.microsoft.com/office/drawing/2016/5/9/chartex" xmlns:cx4="http://schemas.microsoft.com/office/drawing/2016/5/10/chartex" xmlns:cx5="http://schemas.microsoft.com/office/drawing/2016/5/11/chartex" xmlns:cx6="http://schemas.microsoft.com/office/drawing/2016/5/12/chartex" xmlns:cx7="http://schemas.microsoft.com/office/drawing/2016/5/13/chartex" xmlns:cx8="http://schemas.microsoft.com/office/drawing/2016/5/14/chartex" xmlns:mc="http://schemas.openxmlformats.org/markup-compatibility/2006" xmlns:aink="http://schemas.microsoft.com/office/drawing/2016/ink" xmlns:am3d="http://schemas.microsoft.com/office/drawing/2017/model3d" xmlns:o="urn:schemas-microsoft-com:office:office" xmlns:oel="http://schemas.microsoft.com/office/2019/extlst" xmlns:r="http://schemas.openxmlformats.org/officeDocument/2006/relationships" xmlns:m="http://schemas.openxmlformats.org/officeDocument/2006/math" xmlns:v="urn:schemas-microsoft-com:vml" xmlns:wp14="http://schemas.microsoft.com/office/word/2010/wordprocessingDrawing" xmlns:wp="http://schemas.openxmlformats.org/drawingml/2006/wordprocessingDrawing" xmlns:w10="urn:schemas-microsoft-com:office:word" xmlns:w="http://schemas.openxmlformats.org/wordprocessingml/2006/main" xmlns:w14="http://schemas.microsoft.com/office/word/2010/wordml" xmlns:w15="http://schemas.microsoft.com/office/word/2012/wordml" xmlns:w16cex="http://schemas.microsoft.com/office/word/2018/wordml/cex" xmlns:w16cid="http://schemas.microsoft.com/office/word/2016/wordml/cid" xmlns:w16="http://schemas.microsoft.com/office/word/2018/wordml" xmlns:w16du="http://schemas.microsoft.com/office/word/2023/wordml/word16du" xmlns:w16sdtdh="http://schemas.microsoft.com/office/word/2020/wordml/sdtdatahash" xmlns:w16sdtfl="http://schemas.microsoft.com/office/word/2024/wordml/sdtformatlock" xmlns:w16se="http://schemas.microsoft.com/office/word/2015/wordml/symex" xmlns:wpg="http://schemas.microsoft.com/office/word/2010/wordprocessingGroup" xmlns:wpi="http://schemas.microsoft.com/office/word/2010/wordprocessingInk" xmlns:wne="http://schemas.microsoft.com/office/word/2006/wordml" xmlns:wps="http://schemas.microsoft.com/office/word/2010/wordprocessingShape" mc:Ignorable="w14 w15 w16se w16cid w16 w16cex w16sdtdh w16sdtfl w16du wp14">
   <w:footnote w:type="separator" w:id="-1">
     <w:p>
       <w:pPr>
@@ -1631,7 +1843,7 @@
 </file>
 
 <file path=word/numbering.xml><?xml version="1.0" encoding="utf-8"?>
-<w:numbering xmlns:wpc="http://schemas.microsoft.com/office/word/2010/wordprocessingCanvas" xmlns:cx="http://schemas.microsoft.com/office/drawing/2014/chartex" xmlns:cx1="http://schemas.microsoft.com/office/drawing/2015/9/8/chartex" xmlns:cx2="http://schemas.microsoft.com/office/drawing/2015/10/21/chartex" xmlns:cx3="http://schemas.microsoft.com/office/drawing/2016/5/9/chartex" xmlns:cx4="http://schemas.microsoft.com/office/drawing/2016/5/10/chartex" xmlns:cx5="http://schemas.microsoft.com/office/drawing/2016/5/11/chartex" xmlns:cx6="http://schemas.microsoft.com/office/drawing/2016/5/12/chartex" xmlns:cx7="http://schemas.microsoft.com/office/drawing/2016/5/13/chartex" xmlns:cx8="http://schemas.microsoft.com/office/drawing/2016/5/14/chartex" xmlns:mc="http://schemas.openxmlformats.org/markup-compatibility/2006" xmlns:aink="http://schemas.microsoft.com/office/drawing/2016/ink" xmlns:am3d="http://schemas.microsoft.com/office/drawing/2017/model3d" xmlns:o="urn:schemas-microsoft-com:office:office" xmlns:r="http://schemas.openxmlformats.org/officeDocument/2006/relationships" xmlns:m="http://schemas.openxmlformats.org/officeDocument/2006/math" xmlns:v="urn:schemas-microsoft-com:vml" xmlns:wp14="http://schemas.microsoft.com/office/word/2010/wordprocessingDrawing" xmlns:wp="http://schemas.openxmlformats.org/drawingml/2006/wordprocessingDrawing" xmlns:w10="urn:schemas-microsoft-com:office:word" xmlns:w="http://schemas.openxmlformats.org/wordprocessingml/2006/main" xmlns:w14="http://schemas.microsoft.com/office/word/2010/wordml" xmlns:w15="http://schemas.microsoft.com/office/word/2012/wordml" xmlns:w16cid="http://schemas.microsoft.com/office/word/2016/wordml/cid" xmlns:w16se="http://schemas.microsoft.com/office/word/2015/wordml/symex" xmlns:wpg="http://schemas.microsoft.com/office/word/2010/wordprocessingGroup" xmlns:wpi="http://schemas.microsoft.com/office/word/2010/wordprocessingInk" xmlns:wne="http://schemas.microsoft.com/office/word/2006/wordml" xmlns:wps="http://schemas.microsoft.com/office/word/2010/wordprocessingShape" mc:Ignorable="w14 w15 w16se w16cid wp14">
+<w:numbering xmlns:wpc="http://schemas.microsoft.com/office/word/2010/wordprocessingCanvas" xmlns:cx="http://schemas.microsoft.com/office/drawing/2014/chartex" xmlns:cx1="http://schemas.microsoft.com/office/drawing/2015/9/8/chartex" xmlns:cx2="http://schemas.microsoft.com/office/drawing/2015/10/21/chartex" xmlns:cx3="http://schemas.microsoft.com/office/drawing/2016/5/9/chartex" xmlns:cx4="http://schemas.microsoft.com/office/drawing/2016/5/10/chartex" xmlns:cx5="http://schemas.microsoft.com/office/drawing/2016/5/11/chartex" xmlns:cx6="http://schemas.microsoft.com/office/drawing/2016/5/12/chartex" xmlns:cx7="http://schemas.microsoft.com/office/drawing/2016/5/13/chartex" xmlns:cx8="http://schemas.microsoft.com/office/drawing/2016/5/14/chartex" xmlns:mc="http://schemas.openxmlformats.org/markup-compatibility/2006" xmlns:aink="http://schemas.microsoft.com/office/drawing/2016/ink" xmlns:am3d="http://schemas.microsoft.com/office/drawing/2017/model3d" xmlns:o="urn:schemas-microsoft-com:office:office" xmlns:oel="http://schemas.microsoft.com/office/2019/extlst" xmlns:r="http://schemas.openxmlformats.org/officeDocument/2006/relationships" xmlns:m="http://schemas.openxmlformats.org/officeDocument/2006/math" xmlns:v="urn:schemas-microsoft-com:vml" xmlns:wp14="http://schemas.microsoft.com/office/word/2010/wordprocessingDrawing" xmlns:wp="http://schemas.openxmlformats.org/drawingml/2006/wordprocessingDrawing" xmlns:w10="urn:schemas-microsoft-com:office:word" xmlns:w="http://schemas.openxmlformats.org/wordprocessingml/2006/main" xmlns:w14="http://schemas.microsoft.com/office/word/2010/wordml" xmlns:w15="http://schemas.microsoft.com/office/word/2012/wordml" xmlns:w16cex="http://schemas.microsoft.com/office/word/2018/wordml/cex" xmlns:w16cid="http://schemas.microsoft.com/office/word/2016/wordml/cid" xmlns:w16="http://schemas.microsoft.com/office/word/2018/wordml" xmlns:w16du="http://schemas.microsoft.com/office/word/2023/wordml/word16du" xmlns:w16sdtdh="http://schemas.microsoft.com/office/word/2020/wordml/sdtdatahash" xmlns:w16sdtfl="http://schemas.microsoft.com/office/word/2024/wordml/sdtformatlock" xmlns:w16se="http://schemas.microsoft.com/office/word/2015/wordml/symex" xmlns:wpg="http://schemas.microsoft.com/office/word/2010/wordprocessingGroup" xmlns:wpi="http://schemas.microsoft.com/office/word/2010/wordprocessingInk" xmlns:wne="http://schemas.microsoft.com/office/word/2006/wordml" xmlns:wps="http://schemas.microsoft.com/office/word/2010/wordprocessingShape" mc:Ignorable="w14 w15 w16se w16cid w16 w16cex w16sdtdh w16sdtfl w16du wp14">
   <w:abstractNum w:abstractNumId="0" w15:restartNumberingAfterBreak="0">
     <w:nsid w:val="32AC40B0"/>
     <w:multiLevelType w:val="hybridMultilevel"/>
@@ -1721,14 +1933,14 @@
       </w:pPr>
     </w:lvl>
   </w:abstractNum>
-  <w:num w:numId="1">
+  <w:num w:numId="1" w16cid:durableId="602880555">
     <w:abstractNumId w:val="0"/>
   </w:num>
 </w:numbering>
 </file>
 
 <file path=word/styles.xml><?xml version="1.0" encoding="utf-8"?>
-<w:styles xmlns:mc="http://schemas.openxmlformats.org/markup-compatibility/2006" xmlns:r="http://schemas.openxmlformats.org/officeDocument/2006/relationships" xmlns:w="http://schemas.openxmlformats.org/wordprocessingml/2006/main" xmlns:w14="http://schemas.microsoft.com/office/word/2010/wordml" xmlns:w15="http://schemas.microsoft.com/office/word/2012/wordml" xmlns:w16cid="http://schemas.microsoft.com/office/word/2016/wordml/cid" xmlns:w16se="http://schemas.microsoft.com/office/word/2015/wordml/symex" mc:Ignorable="w14 w15 w16se w16cid">
+<w:styles xmlns:mc="http://schemas.openxmlformats.org/markup-compatibility/2006" xmlns:r="http://schemas.openxmlformats.org/officeDocument/2006/relationships" xmlns:w="http://schemas.openxmlformats.org/wordprocessingml/2006/main" xmlns:w14="http://schemas.microsoft.com/office/word/2010/wordml" xmlns:w15="http://schemas.microsoft.com/office/word/2012/wordml" xmlns:w16cex="http://schemas.microsoft.com/office/word/2018/wordml/cex" xmlns:w16cid="http://schemas.microsoft.com/office/word/2016/wordml/cid" xmlns:w16="http://schemas.microsoft.com/office/word/2018/wordml" xmlns:w16du="http://schemas.microsoft.com/office/word/2023/wordml/word16du" xmlns:w16sdtdh="http://schemas.microsoft.com/office/word/2020/wordml/sdtdatahash" xmlns:w16sdtfl="http://schemas.microsoft.com/office/word/2024/wordml/sdtformatlock" xmlns:w16se="http://schemas.microsoft.com/office/word/2015/wordml/symex" mc:Ignorable="w14 w15 w16se w16cid w16 w16cex w16sdtdh w16sdtfl w16du">
   <w:docDefaults>
     <w:rPrDefault>
       <w:rPr>
@@ -1744,7 +1956,7 @@
       </w:pPr>
     </w:pPrDefault>
   </w:docDefaults>
-  <w:latentStyles w:defLockedState="0" w:defUIPriority="99" w:defSemiHidden="0" w:defUnhideWhenUsed="0" w:defQFormat="0" w:count="375">
+  <w:latentStyles w:defLockedState="0" w:defUIPriority="99" w:defSemiHidden="0" w:defUnhideWhenUsed="0" w:defQFormat="0" w:count="376">
     <w:lsdException w:name="Normal" w:uiPriority="0" w:qFormat="1"/>
     <w:lsdException w:name="heading 1" w:uiPriority="9" w:qFormat="1"/>
     <w:lsdException w:name="heading 2" w:semiHidden="1" w:uiPriority="9" w:unhideWhenUsed="1" w:qFormat="1"/>
@@ -2120,6 +2332,7 @@
     <w:lsdException w:name="Smart Hyperlink" w:semiHidden="1" w:unhideWhenUsed="1"/>
     <w:lsdException w:name="Hashtag" w:semiHidden="1" w:unhideWhenUsed="1"/>
     <w:lsdException w:name="Unresolved Mention" w:semiHidden="1" w:unhideWhenUsed="1"/>
+    <w:lsdException w:name="Smart Link" w:semiHidden="1" w:unhideWhenUsed="1"/>
   </w:latentStyles>
   <w:style w:type="paragraph" w:default="1" w:styleId="Normal">
     <w:name w:val="Normal"/>
@@ -2128,7 +2341,6 @@
   <w:style w:type="character" w:default="1" w:styleId="DefaultParagraphFont">
     <w:name w:val="Default Paragraph Font"/>
     <w:uiPriority w:val="1"/>
-    <w:semiHidden/>
     <w:unhideWhenUsed/>
   </w:style>
   <w:style w:type="table" w:default="1" w:styleId="TableNormal">

</xml_diff>